<commit_message>
Privacy: replace repository examples with synthetic data
</commit_message>
<xml_diff>
--- a/templates/source/financial-loan-highlighted-template.docx
+++ b/templates/source/financial-loan-highlighted-template.docx
@@ -3645,7 +3645,7 @@
                 <w:szCs w:val="21"/>
                 <w:lang w:val="en-US" w:eastAsia="zh-CN"/>
               </w:rPr>
-              <w:t>的《中国建设银行个人消费借款合同》（以下统称借款合同）。根据原告</w:t>
+              <w:t>的《示例银行个人消费借款合同》（以下统称借款合同）。根据原告</w:t>
             </w:r>
             <w:r>
               <w:rPr>
@@ -3666,7 +3666,7 @@
                 <w:szCs w:val="21"/>
                 <w:lang w:val="en-US" w:eastAsia="zh-CN"/>
               </w:rPr>
-              <w:t>与债权转让方【中国建设银行股份有限公司湖北省分行】于【2023】年【05】月【19】日签订的编号为【CCBGDZCHB2025004】的《零售类不良贷款批量转让项目资产转让合同》，债权人已受让【</w:t>
+              <w:t>与债权转让方【示例银行股份有限公司示例省分行】于【2023】年【05】月【19】日签订的编号为【DEMO-TRANSFER-2025-001】的《零售类不良贷款批量转让项目资产转让合同》，债权人已受让【</w:t>
             </w:r>
             <w:r>
               <w:rPr>
@@ -5279,7 +5279,7 @@
                 <w:highlight w:val="yellow"/>
                 <w:lang w:val="en-US" w:eastAsia="zh-CN"/>
               </w:rPr>
-              <w:t>《中国建设银行个人消费借款合同》，00000000000000000001</w:t>
+              <w:t>《示例银行个人消费借款合同》，00000000000000000001</w:t>
             </w:r>
           </w:p>
         </w:tc>

</xml_diff>